<commit_message>
nmv 27 08 2026
</commit_message>
<xml_diff>
--- a/TS-Padam/TS-3.4/TS 3.4 Malayalam Pada Paatam Corrections.docx
+++ b/TS-Padam/TS-3.4/TS 3.4 Malayalam Pada Paatam Corrections.docx
@@ -1,6 +1,6 @@
 
 <file path=word/document.xml><?xml version="1.0" encoding="utf-8"?>
-<w:document xmlns:wpc="http://schemas.microsoft.com/office/word/2010/wordprocessingCanvas" xmlns:cx="http://schemas.microsoft.com/office/drawing/2014/chartex" xmlns:cx1="http://schemas.microsoft.com/office/drawing/2015/9/8/chartex" xmlns:cx2="http://schemas.microsoft.com/office/drawing/2015/10/21/chartex" xmlns:cx3="http://schemas.microsoft.com/office/drawing/2016/5/9/chartex" xmlns:cx4="http://schemas.microsoft.com/office/drawing/2016/5/10/chartex" xmlns:cx5="http://schemas.microsoft.com/office/drawing/2016/5/11/chartex" xmlns:cx6="http://schemas.microsoft.com/office/drawing/2016/5/12/chartex" xmlns:cx7="http://schemas.microsoft.com/office/drawing/2016/5/13/chartex" xmlns:cx8="http://schemas.microsoft.com/office/drawing/2016/5/14/chartex" xmlns:mc="http://schemas.openxmlformats.org/markup-compatibility/2006" xmlns:aink="http://schemas.microsoft.com/office/drawing/2016/ink" xmlns:am3d="http://schemas.microsoft.com/office/drawing/2017/model3d" xmlns:o="urn:schemas-microsoft-com:office:office" xmlns:oel="http://schemas.microsoft.com/office/2019/extlst" xmlns:r="http://schemas.openxmlformats.org/officeDocument/2006/relationships" xmlns:m="http://schemas.openxmlformats.org/officeDocument/2006/math" xmlns:v="urn:schemas-microsoft-com:vml" xmlns:wp14="http://schemas.microsoft.com/office/word/2010/wordprocessingDrawing" xmlns:wp="http://schemas.openxmlformats.org/drawingml/2006/wordprocessingDrawing" xmlns:w10="urn:schemas-microsoft-com:office:word" xmlns:w="http://schemas.openxmlformats.org/wordprocessingml/2006/main" xmlns:w14="http://schemas.microsoft.com/office/word/2010/wordml" xmlns:w15="http://schemas.microsoft.com/office/word/2012/wordml" xmlns:w16cei="http://schemas.microsoft.com/office/word/2026/wordml/cei" xmlns:w16cex="http://schemas.microsoft.com/office/word/2018/wordml/cex" xmlns:w16cid="http://schemas.microsoft.com/office/word/2016/wordml/cid" xmlns:w16="http://schemas.microsoft.com/office/word/2018/wordml" xmlns:w16du="http://schemas.microsoft.com/office/word/2023/wordml/word16du" xmlns:w16sdtdh="http://schemas.microsoft.com/office/word/2020/wordml/sdtdatahash" xmlns:w16sdtfl="http://schemas.microsoft.com/office/word/2024/wordml/sdtformatlock" xmlns:w16se="http://schemas.microsoft.com/office/word/2015/wordml/symex" xmlns:wpg="http://schemas.microsoft.com/office/word/2010/wordprocessingGroup" xmlns:wpi="http://schemas.microsoft.com/office/word/2010/wordprocessingInk" xmlns:wne="http://schemas.microsoft.com/office/word/2006/wordml" xmlns:wps="http://schemas.microsoft.com/office/word/2010/wordprocessingShape" mc:Ignorable="w14 w15 w16se w16cid w16 w16cex w16sdtdh w16sdtfl w16du wp14">
+<w:document xmlns:wpc="http://schemas.microsoft.com/office/word/2010/wordprocessingCanvas" xmlns:cx="http://schemas.microsoft.com/office/drawing/2014/chartex" xmlns:cx1="http://schemas.microsoft.com/office/drawing/2015/9/8/chartex" xmlns:cx2="http://schemas.microsoft.com/office/drawing/2015/10/21/chartex" xmlns:cx3="http://schemas.microsoft.com/office/drawing/2016/5/9/chartex" xmlns:cx4="http://schemas.microsoft.com/office/drawing/2016/5/10/chartex" xmlns:cx5="http://schemas.microsoft.com/office/drawing/2016/5/11/chartex" xmlns:cx6="http://schemas.microsoft.com/office/drawing/2016/5/12/chartex" xmlns:cx7="http://schemas.microsoft.com/office/drawing/2016/5/13/chartex" xmlns:cx8="http://schemas.microsoft.com/office/drawing/2016/5/14/chartex" xmlns:mc="http://schemas.openxmlformats.org/markup-compatibility/2006" xmlns:aink="http://schemas.microsoft.com/office/drawing/2016/ink" xmlns:am3d="http://schemas.microsoft.com/office/drawing/2017/model3d" xmlns:o="urn:schemas-microsoft-com:office:office" xmlns:oel="http://schemas.microsoft.com/office/2019/extlst" xmlns:r="http://schemas.openxmlformats.org/officeDocument/2006/relationships" xmlns:m="http://schemas.openxmlformats.org/officeDocument/2006/math" xmlns:v="urn:schemas-microsoft-com:vml" xmlns:wp14="http://schemas.microsoft.com/office/word/2010/wordprocessingDrawing" xmlns:wp="http://schemas.openxmlformats.org/drawingml/2006/wordprocessingDrawing" xmlns:w10="urn:schemas-microsoft-com:office:word" xmlns:w="http://schemas.openxmlformats.org/wordprocessingml/2006/main" xmlns:w14="http://schemas.microsoft.com/office/word/2010/wordml" xmlns:w15="http://schemas.microsoft.com/office/word/2012/wordml" xmlns:w16cex="http://schemas.microsoft.com/office/word/2018/wordml/cex" xmlns:w16cid="http://schemas.microsoft.com/office/word/2016/wordml/cid" xmlns:w16="http://schemas.microsoft.com/office/word/2018/wordml" xmlns:w16du="http://schemas.microsoft.com/office/word/2023/wordml/word16du" xmlns:w16sdtdh="http://schemas.microsoft.com/office/word/2020/wordml/sdtdatahash" xmlns:w16sdtfl="http://schemas.microsoft.com/office/word/2024/wordml/sdtformatlock" xmlns:w16se="http://schemas.microsoft.com/office/word/2015/wordml/symex" xmlns:wpg="http://schemas.microsoft.com/office/word/2010/wordprocessingGroup" xmlns:wpi="http://schemas.microsoft.com/office/word/2010/wordprocessingInk" xmlns:wne="http://schemas.microsoft.com/office/word/2006/wordml" xmlns:wps="http://schemas.microsoft.com/office/word/2010/wordprocessingShape" mc:Ignorable="w14 w15 w16se w16cid w16 w16cex w16sdtdh w16sdtfl w16du wp14">
   <w:body>
     <w:p>
       <w:pPr>
@@ -2105,16 +2105,7 @@
                 <w:sz w:val="28"/>
                 <w:szCs w:val="28"/>
               </w:rPr>
-              <w:t>9.</w:t>
-            </w:r>
-            <w:r>
-              <w:rPr>
-                <w:b/>
-                <w:bCs/>
-                <w:sz w:val="28"/>
-                <w:szCs w:val="28"/>
-              </w:rPr>
-              <w:t>2</w:t>
+              <w:t>9.2</w:t>
             </w:r>
             <w:r>
               <w:rPr>
@@ -3323,34 +3314,6 @@
         </w:rPr>
         <w:t>===========</w:t>
       </w:r>
-    </w:p>
-    <w:p>
-      <w:pPr>
-        <w:ind w:left="-142"/>
-        <w:jc w:val="center"/>
-        <w:rPr>
-          <w:b/>
-          <w:bCs/>
-          <w:sz w:val="32"/>
-          <w:szCs w:val="32"/>
-          <w:u w:val="single"/>
-          <w:lang w:val="en-IN"/>
-        </w:rPr>
-      </w:pPr>
-    </w:p>
-    <w:p>
-      <w:pPr>
-        <w:ind w:left="-142"/>
-        <w:jc w:val="center"/>
-        <w:rPr>
-          <w:b/>
-          <w:bCs/>
-          <w:sz w:val="32"/>
-          <w:szCs w:val="32"/>
-          <w:u w:val="single"/>
-          <w:lang w:val="en-IN"/>
-        </w:rPr>
-      </w:pPr>
     </w:p>
     <w:p>
       <w:pPr>
@@ -3611,7 +3574,6 @@
                 <w:sz w:val="28"/>
                 <w:szCs w:val="28"/>
               </w:rPr>
-              <w:lastRenderedPageBreak/>
               <w:t>TS 3.4.</w:t>
             </w:r>
             <w:r>
@@ -4000,6 +3962,7 @@
                 <w:sz w:val="28"/>
                 <w:szCs w:val="28"/>
               </w:rPr>
+              <w:lastRenderedPageBreak/>
               <w:t>TS 3.4.</w:t>
             </w:r>
             <w:r>
@@ -5119,32 +5082,6 @@
         </w:rPr>
         <w:t>==============</w:t>
       </w:r>
-    </w:p>
-    <w:p>
-      <w:pPr>
-        <w:ind w:left="-142"/>
-        <w:jc w:val="center"/>
-        <w:rPr>
-          <w:b/>
-          <w:bCs/>
-          <w:sz w:val="32"/>
-          <w:szCs w:val="32"/>
-          <w:u w:val="single"/>
-        </w:rPr>
-      </w:pPr>
-    </w:p>
-    <w:p>
-      <w:pPr>
-        <w:ind w:left="-142"/>
-        <w:jc w:val="center"/>
-        <w:rPr>
-          <w:b/>
-          <w:bCs/>
-          <w:sz w:val="32"/>
-          <w:szCs w:val="32"/>
-          <w:u w:val="single"/>
-        </w:rPr>
-      </w:pPr>
     </w:p>
     <w:p>
       <w:pPr>
@@ -5330,7 +5267,6 @@
                 <w:sz w:val="32"/>
                 <w:szCs w:val="32"/>
               </w:rPr>
-              <w:lastRenderedPageBreak/>
               <w:t>Reference</w:t>
             </w:r>
           </w:p>
@@ -5357,7 +5293,6 @@
                 <w:sz w:val="32"/>
                 <w:szCs w:val="32"/>
               </w:rPr>
-              <w:lastRenderedPageBreak/>
               <w:t>As Printed</w:t>
             </w:r>
           </w:p>
@@ -5960,6 +5895,7 @@
                 <w:sz w:val="28"/>
                 <w:szCs w:val="28"/>
               </w:rPr>
+              <w:lastRenderedPageBreak/>
               <w:t xml:space="preserve">TS 3.4.7.2 </w:t>
             </w:r>
             <w:r>
@@ -7309,7 +7245,6 @@
                 <w:sz w:val="28"/>
                 <w:szCs w:val="28"/>
               </w:rPr>
-              <w:lastRenderedPageBreak/>
               <w:t>Panchaati No. - 39</w:t>
             </w:r>
           </w:p>
@@ -7335,7 +7270,6 @@
                 <w:sz w:val="40"/>
                 <w:szCs w:val="40"/>
               </w:rPr>
-              <w:lastRenderedPageBreak/>
               <w:t>jb—p</w:t>
             </w:r>
             <w:r>
@@ -7472,7 +7406,6 @@
                 <w:b/>
                 <w:bCs/>
               </w:rPr>
-              <w:lastRenderedPageBreak/>
               <w:t>(better</w:t>
             </w:r>
             <w:r>
@@ -7517,7 +7450,6 @@
                 <w:sz w:val="28"/>
                 <w:szCs w:val="28"/>
               </w:rPr>
-              <w:lastRenderedPageBreak/>
               <w:t>TS 3.4.</w:t>
             </w:r>
             <w:r>
@@ -7971,6 +7903,7 @@
           <w:szCs w:val="32"/>
           <w:u w:val="single"/>
         </w:rPr>
+        <w:lastRenderedPageBreak/>
         <w:t>TS</w:t>
       </w:r>
       <w:r>
@@ -9147,7 +9080,6 @@
                 <w:szCs w:val="32"/>
                 <w:lang w:eastAsia="en-IN" w:bidi="ml-IN"/>
               </w:rPr>
-              <w:lastRenderedPageBreak/>
               <w:t>TS 3.4.7.2</w:t>
             </w:r>
             <w:r>
@@ -9692,6 +9624,7 @@
                 <w:szCs w:val="32"/>
                 <w:lang w:eastAsia="en-IN" w:bidi="ml-IN"/>
               </w:rPr>
+              <w:lastRenderedPageBreak/>
               <w:t>TS 3.4.7.3</w:t>
             </w:r>
             <w:r>
@@ -10179,7 +10112,7 @@
 </file>
 
 <file path=word/endnotes.xml><?xml version="1.0" encoding="utf-8"?>
-<w:endnotes xmlns:wpc="http://schemas.microsoft.com/office/word/2010/wordprocessingCanvas" xmlns:cx="http://schemas.microsoft.com/office/drawing/2014/chartex" xmlns:cx1="http://schemas.microsoft.com/office/drawing/2015/9/8/chartex" xmlns:cx2="http://schemas.microsoft.com/office/drawing/2015/10/21/chartex" xmlns:cx3="http://schemas.microsoft.com/office/drawing/2016/5/9/chartex" xmlns:cx4="http://schemas.microsoft.com/office/drawing/2016/5/10/chartex" xmlns:cx5="http://schemas.microsoft.com/office/drawing/2016/5/11/chartex" xmlns:cx6="http://schemas.microsoft.com/office/drawing/2016/5/12/chartex" xmlns:cx7="http://schemas.microsoft.com/office/drawing/2016/5/13/chartex" xmlns:cx8="http://schemas.microsoft.com/office/drawing/2016/5/14/chartex" xmlns:mc="http://schemas.openxmlformats.org/markup-compatibility/2006" xmlns:aink="http://schemas.microsoft.com/office/drawing/2016/ink" xmlns:am3d="http://schemas.microsoft.com/office/drawing/2017/model3d" xmlns:o="urn:schemas-microsoft-com:office:office" xmlns:oel="http://schemas.microsoft.com/office/2019/extlst" xmlns:r="http://schemas.openxmlformats.org/officeDocument/2006/relationships" xmlns:m="http://schemas.openxmlformats.org/officeDocument/2006/math" xmlns:v="urn:schemas-microsoft-com:vml" xmlns:wp14="http://schemas.microsoft.com/office/word/2010/wordprocessingDrawing" xmlns:wp="http://schemas.openxmlformats.org/drawingml/2006/wordprocessingDrawing" xmlns:w10="urn:schemas-microsoft-com:office:word" xmlns:w="http://schemas.openxmlformats.org/wordprocessingml/2006/main" xmlns:w14="http://schemas.microsoft.com/office/word/2010/wordml" xmlns:w15="http://schemas.microsoft.com/office/word/2012/wordml" xmlns:w16cei="http://schemas.microsoft.com/office/word/2026/wordml/cei" xmlns:w16cex="http://schemas.microsoft.com/office/word/2018/wordml/cex" xmlns:w16cid="http://schemas.microsoft.com/office/word/2016/wordml/cid" xmlns:w16="http://schemas.microsoft.com/office/word/2018/wordml" xmlns:w16du="http://schemas.microsoft.com/office/word/2023/wordml/word16du" xmlns:w16sdtdh="http://schemas.microsoft.com/office/word/2020/wordml/sdtdatahash" xmlns:w16sdtfl="http://schemas.microsoft.com/office/word/2024/wordml/sdtformatlock" xmlns:w16se="http://schemas.microsoft.com/office/word/2015/wordml/symex" xmlns:wpg="http://schemas.microsoft.com/office/word/2010/wordprocessingGroup" xmlns:wpi="http://schemas.microsoft.com/office/word/2010/wordprocessingInk" xmlns:wne="http://schemas.microsoft.com/office/word/2006/wordml" xmlns:wps="http://schemas.microsoft.com/office/word/2010/wordprocessingShape" mc:Ignorable="w14 w15 w16se w16cid w16 w16cex w16sdtdh w16sdtfl w16du wp14">
+<w:endnotes xmlns:wpc="http://schemas.microsoft.com/office/word/2010/wordprocessingCanvas" xmlns:cx="http://schemas.microsoft.com/office/drawing/2014/chartex" xmlns:cx1="http://schemas.microsoft.com/office/drawing/2015/9/8/chartex" xmlns:cx2="http://schemas.microsoft.com/office/drawing/2015/10/21/chartex" xmlns:cx3="http://schemas.microsoft.com/office/drawing/2016/5/9/chartex" xmlns:cx4="http://schemas.microsoft.com/office/drawing/2016/5/10/chartex" xmlns:cx5="http://schemas.microsoft.com/office/drawing/2016/5/11/chartex" xmlns:cx6="http://schemas.microsoft.com/office/drawing/2016/5/12/chartex" xmlns:cx7="http://schemas.microsoft.com/office/drawing/2016/5/13/chartex" xmlns:cx8="http://schemas.microsoft.com/office/drawing/2016/5/14/chartex" xmlns:mc="http://schemas.openxmlformats.org/markup-compatibility/2006" xmlns:aink="http://schemas.microsoft.com/office/drawing/2016/ink" xmlns:am3d="http://schemas.microsoft.com/office/drawing/2017/model3d" xmlns:o="urn:schemas-microsoft-com:office:office" xmlns:oel="http://schemas.microsoft.com/office/2019/extlst" xmlns:r="http://schemas.openxmlformats.org/officeDocument/2006/relationships" xmlns:m="http://schemas.openxmlformats.org/officeDocument/2006/math" xmlns:v="urn:schemas-microsoft-com:vml" xmlns:wp14="http://schemas.microsoft.com/office/word/2010/wordprocessingDrawing" xmlns:wp="http://schemas.openxmlformats.org/drawingml/2006/wordprocessingDrawing" xmlns:w10="urn:schemas-microsoft-com:office:word" xmlns:w="http://schemas.openxmlformats.org/wordprocessingml/2006/main" xmlns:w14="http://schemas.microsoft.com/office/word/2010/wordml" xmlns:w15="http://schemas.microsoft.com/office/word/2012/wordml" xmlns:w16cex="http://schemas.microsoft.com/office/word/2018/wordml/cex" xmlns:w16cid="http://schemas.microsoft.com/office/word/2016/wordml/cid" xmlns:w16="http://schemas.microsoft.com/office/word/2018/wordml" xmlns:w16du="http://schemas.microsoft.com/office/word/2023/wordml/word16du" xmlns:w16sdtdh="http://schemas.microsoft.com/office/word/2020/wordml/sdtdatahash" xmlns:w16sdtfl="http://schemas.microsoft.com/office/word/2024/wordml/sdtformatlock" xmlns:w16se="http://schemas.microsoft.com/office/word/2015/wordml/symex" xmlns:wpg="http://schemas.microsoft.com/office/word/2010/wordprocessingGroup" xmlns:wpi="http://schemas.microsoft.com/office/word/2010/wordprocessingInk" xmlns:wne="http://schemas.microsoft.com/office/word/2006/wordml" xmlns:wps="http://schemas.microsoft.com/office/word/2010/wordprocessingShape" mc:Ignorable="w14 w15 w16se w16cid w16 w16cex w16sdtdh w16sdtfl w16du wp14">
   <w:endnote w:type="separator" w:id="-1">
     <w:p>
       <w:pPr>
@@ -10204,7 +10137,7 @@
 </file>
 
 <file path=word/footer1.xml><?xml version="1.0" encoding="utf-8"?>
-<w:ftr xmlns:wpc="http://schemas.microsoft.com/office/word/2010/wordprocessingCanvas" xmlns:cx="http://schemas.microsoft.com/office/drawing/2014/chartex" xmlns:cx1="http://schemas.microsoft.com/office/drawing/2015/9/8/chartex" xmlns:cx2="http://schemas.microsoft.com/office/drawing/2015/10/21/chartex" xmlns:cx3="http://schemas.microsoft.com/office/drawing/2016/5/9/chartex" xmlns:cx4="http://schemas.microsoft.com/office/drawing/2016/5/10/chartex" xmlns:cx5="http://schemas.microsoft.com/office/drawing/2016/5/11/chartex" xmlns:cx6="http://schemas.microsoft.com/office/drawing/2016/5/12/chartex" xmlns:cx7="http://schemas.microsoft.com/office/drawing/2016/5/13/chartex" xmlns:cx8="http://schemas.microsoft.com/office/drawing/2016/5/14/chartex" xmlns:mc="http://schemas.openxmlformats.org/markup-compatibility/2006" xmlns:aink="http://schemas.microsoft.com/office/drawing/2016/ink" xmlns:am3d="http://schemas.microsoft.com/office/drawing/2017/model3d" xmlns:o="urn:schemas-microsoft-com:office:office" xmlns:oel="http://schemas.microsoft.com/office/2019/extlst" xmlns:r="http://schemas.openxmlformats.org/officeDocument/2006/relationships" xmlns:m="http://schemas.openxmlformats.org/officeDocument/2006/math" xmlns:v="urn:schemas-microsoft-com:vml" xmlns:wp14="http://schemas.microsoft.com/office/word/2010/wordprocessingDrawing" xmlns:wp="http://schemas.openxmlformats.org/drawingml/2006/wordprocessingDrawing" xmlns:w10="urn:schemas-microsoft-com:office:word" xmlns:w="http://schemas.openxmlformats.org/wordprocessingml/2006/main" xmlns:w14="http://schemas.microsoft.com/office/word/2010/wordml" xmlns:w15="http://schemas.microsoft.com/office/word/2012/wordml" xmlns:w16cei="http://schemas.microsoft.com/office/word/2026/wordml/cei" xmlns:w16cex="http://schemas.microsoft.com/office/word/2018/wordml/cex" xmlns:w16cid="http://schemas.microsoft.com/office/word/2016/wordml/cid" xmlns:w16="http://schemas.microsoft.com/office/word/2018/wordml" xmlns:w16du="http://schemas.microsoft.com/office/word/2023/wordml/word16du" xmlns:w16sdtdh="http://schemas.microsoft.com/office/word/2020/wordml/sdtdatahash" xmlns:w16sdtfl="http://schemas.microsoft.com/office/word/2024/wordml/sdtformatlock" xmlns:w16se="http://schemas.microsoft.com/office/word/2015/wordml/symex" xmlns:wpg="http://schemas.microsoft.com/office/word/2010/wordprocessingGroup" xmlns:wpi="http://schemas.microsoft.com/office/word/2010/wordprocessingInk" xmlns:wne="http://schemas.microsoft.com/office/word/2006/wordml" xmlns:wps="http://schemas.microsoft.com/office/word/2010/wordprocessingShape" mc:Ignorable="w14 w15 w16se w16cid w16 w16cex w16sdtdh w16sdtfl w16du wp14">
+<w:ftr xmlns:wpc="http://schemas.microsoft.com/office/word/2010/wordprocessingCanvas" xmlns:cx="http://schemas.microsoft.com/office/drawing/2014/chartex" xmlns:cx1="http://schemas.microsoft.com/office/drawing/2015/9/8/chartex" xmlns:cx2="http://schemas.microsoft.com/office/drawing/2015/10/21/chartex" xmlns:cx3="http://schemas.microsoft.com/office/drawing/2016/5/9/chartex" xmlns:cx4="http://schemas.microsoft.com/office/drawing/2016/5/10/chartex" xmlns:cx5="http://schemas.microsoft.com/office/drawing/2016/5/11/chartex" xmlns:cx6="http://schemas.microsoft.com/office/drawing/2016/5/12/chartex" xmlns:cx7="http://schemas.microsoft.com/office/drawing/2016/5/13/chartex" xmlns:cx8="http://schemas.microsoft.com/office/drawing/2016/5/14/chartex" xmlns:mc="http://schemas.openxmlformats.org/markup-compatibility/2006" xmlns:aink="http://schemas.microsoft.com/office/drawing/2016/ink" xmlns:am3d="http://schemas.microsoft.com/office/drawing/2017/model3d" xmlns:o="urn:schemas-microsoft-com:office:office" xmlns:oel="http://schemas.microsoft.com/office/2019/extlst" xmlns:r="http://schemas.openxmlformats.org/officeDocument/2006/relationships" xmlns:m="http://schemas.openxmlformats.org/officeDocument/2006/math" xmlns:v="urn:schemas-microsoft-com:vml" xmlns:wp14="http://schemas.microsoft.com/office/word/2010/wordprocessingDrawing" xmlns:wp="http://schemas.openxmlformats.org/drawingml/2006/wordprocessingDrawing" xmlns:w10="urn:schemas-microsoft-com:office:word" xmlns:w="http://schemas.openxmlformats.org/wordprocessingml/2006/main" xmlns:w14="http://schemas.microsoft.com/office/word/2010/wordml" xmlns:w15="http://schemas.microsoft.com/office/word/2012/wordml" xmlns:w16cex="http://schemas.microsoft.com/office/word/2018/wordml/cex" xmlns:w16cid="http://schemas.microsoft.com/office/word/2016/wordml/cid" xmlns:w16="http://schemas.microsoft.com/office/word/2018/wordml" xmlns:w16du="http://schemas.microsoft.com/office/word/2023/wordml/word16du" xmlns:w16sdtdh="http://schemas.microsoft.com/office/word/2020/wordml/sdtdatahash" xmlns:w16sdtfl="http://schemas.microsoft.com/office/word/2024/wordml/sdtformatlock" xmlns:w16se="http://schemas.microsoft.com/office/word/2015/wordml/symex" xmlns:wpg="http://schemas.microsoft.com/office/word/2010/wordprocessingGroup" xmlns:wpi="http://schemas.microsoft.com/office/word/2010/wordprocessingInk" xmlns:wne="http://schemas.microsoft.com/office/word/2006/wordml" xmlns:wps="http://schemas.microsoft.com/office/word/2010/wordprocessingShape" mc:Ignorable="w14 w15 w16se w16cid w16 w16cex w16sdtdh w16sdtfl w16du wp14">
   <w:p>
     <w:pPr>
       <w:pBdr>
@@ -10393,7 +10326,7 @@
 </file>
 
 <file path=word/footnotes.xml><?xml version="1.0" encoding="utf-8"?>
-<w:footnotes xmlns:wpc="http://schemas.microsoft.com/office/word/2010/wordprocessingCanvas" xmlns:cx="http://schemas.microsoft.com/office/drawing/2014/chartex" xmlns:cx1="http://schemas.microsoft.com/office/drawing/2015/9/8/chartex" xmlns:cx2="http://schemas.microsoft.com/office/drawing/2015/10/21/chartex" xmlns:cx3="http://schemas.microsoft.com/office/drawing/2016/5/9/chartex" xmlns:cx4="http://schemas.microsoft.com/office/drawing/2016/5/10/chartex" xmlns:cx5="http://schemas.microsoft.com/office/drawing/2016/5/11/chartex" xmlns:cx6="http://schemas.microsoft.com/office/drawing/2016/5/12/chartex" xmlns:cx7="http://schemas.microsoft.com/office/drawing/2016/5/13/chartex" xmlns:cx8="http://schemas.microsoft.com/office/drawing/2016/5/14/chartex" xmlns:mc="http://schemas.openxmlformats.org/markup-compatibility/2006" xmlns:aink="http://schemas.microsoft.com/office/drawing/2016/ink" xmlns:am3d="http://schemas.microsoft.com/office/drawing/2017/model3d" xmlns:o="urn:schemas-microsoft-com:office:office" xmlns:oel="http://schemas.microsoft.com/office/2019/extlst" xmlns:r="http://schemas.openxmlformats.org/officeDocument/2006/relationships" xmlns:m="http://schemas.openxmlformats.org/officeDocument/2006/math" xmlns:v="urn:schemas-microsoft-com:vml" xmlns:wp14="http://schemas.microsoft.com/office/word/2010/wordprocessingDrawing" xmlns:wp="http://schemas.openxmlformats.org/drawingml/2006/wordprocessingDrawing" xmlns:w10="urn:schemas-microsoft-com:office:word" xmlns:w="http://schemas.openxmlformats.org/wordprocessingml/2006/main" xmlns:w14="http://schemas.microsoft.com/office/word/2010/wordml" xmlns:w15="http://schemas.microsoft.com/office/word/2012/wordml" xmlns:w16cei="http://schemas.microsoft.com/office/word/2026/wordml/cei" xmlns:w16cex="http://schemas.microsoft.com/office/word/2018/wordml/cex" xmlns:w16cid="http://schemas.microsoft.com/office/word/2016/wordml/cid" xmlns:w16="http://schemas.microsoft.com/office/word/2018/wordml" xmlns:w16du="http://schemas.microsoft.com/office/word/2023/wordml/word16du" xmlns:w16sdtdh="http://schemas.microsoft.com/office/word/2020/wordml/sdtdatahash" xmlns:w16sdtfl="http://schemas.microsoft.com/office/word/2024/wordml/sdtformatlock" xmlns:w16se="http://schemas.microsoft.com/office/word/2015/wordml/symex" xmlns:wpg="http://schemas.microsoft.com/office/word/2010/wordprocessingGroup" xmlns:wpi="http://schemas.microsoft.com/office/word/2010/wordprocessingInk" xmlns:wne="http://schemas.microsoft.com/office/word/2006/wordml" xmlns:wps="http://schemas.microsoft.com/office/word/2010/wordprocessingShape" mc:Ignorable="w14 w15 w16se w16cid w16 w16cex w16sdtdh w16sdtfl w16du wp14">
+<w:footnotes xmlns:wpc="http://schemas.microsoft.com/office/word/2010/wordprocessingCanvas" xmlns:cx="http://schemas.microsoft.com/office/drawing/2014/chartex" xmlns:cx1="http://schemas.microsoft.com/office/drawing/2015/9/8/chartex" xmlns:cx2="http://schemas.microsoft.com/office/drawing/2015/10/21/chartex" xmlns:cx3="http://schemas.microsoft.com/office/drawing/2016/5/9/chartex" xmlns:cx4="http://schemas.microsoft.com/office/drawing/2016/5/10/chartex" xmlns:cx5="http://schemas.microsoft.com/office/drawing/2016/5/11/chartex" xmlns:cx6="http://schemas.microsoft.com/office/drawing/2016/5/12/chartex" xmlns:cx7="http://schemas.microsoft.com/office/drawing/2016/5/13/chartex" xmlns:cx8="http://schemas.microsoft.com/office/drawing/2016/5/14/chartex" xmlns:mc="http://schemas.openxmlformats.org/markup-compatibility/2006" xmlns:aink="http://schemas.microsoft.com/office/drawing/2016/ink" xmlns:am3d="http://schemas.microsoft.com/office/drawing/2017/model3d" xmlns:o="urn:schemas-microsoft-com:office:office" xmlns:oel="http://schemas.microsoft.com/office/2019/extlst" xmlns:r="http://schemas.openxmlformats.org/officeDocument/2006/relationships" xmlns:m="http://schemas.openxmlformats.org/officeDocument/2006/math" xmlns:v="urn:schemas-microsoft-com:vml" xmlns:wp14="http://schemas.microsoft.com/office/word/2010/wordprocessingDrawing" xmlns:wp="http://schemas.openxmlformats.org/drawingml/2006/wordprocessingDrawing" xmlns:w10="urn:schemas-microsoft-com:office:word" xmlns:w="http://schemas.openxmlformats.org/wordprocessingml/2006/main" xmlns:w14="http://schemas.microsoft.com/office/word/2010/wordml" xmlns:w15="http://schemas.microsoft.com/office/word/2012/wordml" xmlns:w16cex="http://schemas.microsoft.com/office/word/2018/wordml/cex" xmlns:w16cid="http://schemas.microsoft.com/office/word/2016/wordml/cid" xmlns:w16="http://schemas.microsoft.com/office/word/2018/wordml" xmlns:w16du="http://schemas.microsoft.com/office/word/2023/wordml/word16du" xmlns:w16sdtdh="http://schemas.microsoft.com/office/word/2020/wordml/sdtdatahash" xmlns:w16sdtfl="http://schemas.microsoft.com/office/word/2024/wordml/sdtformatlock" xmlns:w16se="http://schemas.microsoft.com/office/word/2015/wordml/symex" xmlns:wpg="http://schemas.microsoft.com/office/word/2010/wordprocessingGroup" xmlns:wpi="http://schemas.microsoft.com/office/word/2010/wordprocessingInk" xmlns:wne="http://schemas.microsoft.com/office/word/2006/wordml" xmlns:wps="http://schemas.microsoft.com/office/word/2010/wordprocessingShape" mc:Ignorable="w14 w15 w16se w16cid w16 w16cex w16sdtdh w16sdtfl w16du wp14">
   <w:footnote w:type="separator" w:id="-1">
     <w:p>
       <w:pPr>
@@ -10418,7 +10351,7 @@
 </file>
 
 <file path=word/header1.xml><?xml version="1.0" encoding="utf-8"?>
-<w:hdr xmlns:wpc="http://schemas.microsoft.com/office/word/2010/wordprocessingCanvas" xmlns:cx="http://schemas.microsoft.com/office/drawing/2014/chartex" xmlns:cx1="http://schemas.microsoft.com/office/drawing/2015/9/8/chartex" xmlns:cx2="http://schemas.microsoft.com/office/drawing/2015/10/21/chartex" xmlns:cx3="http://schemas.microsoft.com/office/drawing/2016/5/9/chartex" xmlns:cx4="http://schemas.microsoft.com/office/drawing/2016/5/10/chartex" xmlns:cx5="http://schemas.microsoft.com/office/drawing/2016/5/11/chartex" xmlns:cx6="http://schemas.microsoft.com/office/drawing/2016/5/12/chartex" xmlns:cx7="http://schemas.microsoft.com/office/drawing/2016/5/13/chartex" xmlns:cx8="http://schemas.microsoft.com/office/drawing/2016/5/14/chartex" xmlns:mc="http://schemas.openxmlformats.org/markup-compatibility/2006" xmlns:aink="http://schemas.microsoft.com/office/drawing/2016/ink" xmlns:am3d="http://schemas.microsoft.com/office/drawing/2017/model3d" xmlns:o="urn:schemas-microsoft-com:office:office" xmlns:oel="http://schemas.microsoft.com/office/2019/extlst" xmlns:r="http://schemas.openxmlformats.org/officeDocument/2006/relationships" xmlns:m="http://schemas.openxmlformats.org/officeDocument/2006/math" xmlns:v="urn:schemas-microsoft-com:vml" xmlns:wp14="http://schemas.microsoft.com/office/word/2010/wordprocessingDrawing" xmlns:wp="http://schemas.openxmlformats.org/drawingml/2006/wordprocessingDrawing" xmlns:w10="urn:schemas-microsoft-com:office:word" xmlns:w="http://schemas.openxmlformats.org/wordprocessingml/2006/main" xmlns:w14="http://schemas.microsoft.com/office/word/2010/wordml" xmlns:w15="http://schemas.microsoft.com/office/word/2012/wordml" xmlns:w16cei="http://schemas.microsoft.com/office/word/2026/wordml/cei" xmlns:w16cex="http://schemas.microsoft.com/office/word/2018/wordml/cex" xmlns:w16cid="http://schemas.microsoft.com/office/word/2016/wordml/cid" xmlns:w16="http://schemas.microsoft.com/office/word/2018/wordml" xmlns:w16du="http://schemas.microsoft.com/office/word/2023/wordml/word16du" xmlns:w16sdtdh="http://schemas.microsoft.com/office/word/2020/wordml/sdtdatahash" xmlns:w16sdtfl="http://schemas.microsoft.com/office/word/2024/wordml/sdtformatlock" xmlns:w16se="http://schemas.microsoft.com/office/word/2015/wordml/symex" xmlns:wpg="http://schemas.microsoft.com/office/word/2010/wordprocessingGroup" xmlns:wpi="http://schemas.microsoft.com/office/word/2010/wordprocessingInk" xmlns:wne="http://schemas.microsoft.com/office/word/2006/wordml" xmlns:wps="http://schemas.microsoft.com/office/word/2010/wordprocessingShape" mc:Ignorable="w14 w15 w16se w16cid w16 w16cex w16sdtdh w16sdtfl w16du wp14">
+<w:hdr xmlns:wpc="http://schemas.microsoft.com/office/word/2010/wordprocessingCanvas" xmlns:cx="http://schemas.microsoft.com/office/drawing/2014/chartex" xmlns:cx1="http://schemas.microsoft.com/office/drawing/2015/9/8/chartex" xmlns:cx2="http://schemas.microsoft.com/office/drawing/2015/10/21/chartex" xmlns:cx3="http://schemas.microsoft.com/office/drawing/2016/5/9/chartex" xmlns:cx4="http://schemas.microsoft.com/office/drawing/2016/5/10/chartex" xmlns:cx5="http://schemas.microsoft.com/office/drawing/2016/5/11/chartex" xmlns:cx6="http://schemas.microsoft.com/office/drawing/2016/5/12/chartex" xmlns:cx7="http://schemas.microsoft.com/office/drawing/2016/5/13/chartex" xmlns:cx8="http://schemas.microsoft.com/office/drawing/2016/5/14/chartex" xmlns:mc="http://schemas.openxmlformats.org/markup-compatibility/2006" xmlns:aink="http://schemas.microsoft.com/office/drawing/2016/ink" xmlns:am3d="http://schemas.microsoft.com/office/drawing/2017/model3d" xmlns:o="urn:schemas-microsoft-com:office:office" xmlns:oel="http://schemas.microsoft.com/office/2019/extlst" xmlns:r="http://schemas.openxmlformats.org/officeDocument/2006/relationships" xmlns:m="http://schemas.openxmlformats.org/officeDocument/2006/math" xmlns:v="urn:schemas-microsoft-com:vml" xmlns:wp14="http://schemas.microsoft.com/office/word/2010/wordprocessingDrawing" xmlns:wp="http://schemas.openxmlformats.org/drawingml/2006/wordprocessingDrawing" xmlns:w10="urn:schemas-microsoft-com:office:word" xmlns:w="http://schemas.openxmlformats.org/wordprocessingml/2006/main" xmlns:w14="http://schemas.microsoft.com/office/word/2010/wordml" xmlns:w15="http://schemas.microsoft.com/office/word/2012/wordml" xmlns:w16cex="http://schemas.microsoft.com/office/word/2018/wordml/cex" xmlns:w16cid="http://schemas.microsoft.com/office/word/2016/wordml/cid" xmlns:w16="http://schemas.microsoft.com/office/word/2018/wordml" xmlns:w16du="http://schemas.microsoft.com/office/word/2023/wordml/word16du" xmlns:w16sdtdh="http://schemas.microsoft.com/office/word/2020/wordml/sdtdatahash" xmlns:w16sdtfl="http://schemas.microsoft.com/office/word/2024/wordml/sdtformatlock" xmlns:w16se="http://schemas.microsoft.com/office/word/2015/wordml/symex" xmlns:wpg="http://schemas.microsoft.com/office/word/2010/wordprocessingGroup" xmlns:wpi="http://schemas.microsoft.com/office/word/2010/wordprocessingInk" xmlns:wne="http://schemas.microsoft.com/office/word/2006/wordml" xmlns:wps="http://schemas.microsoft.com/office/word/2010/wordprocessingShape" mc:Ignorable="w14 w15 w16se w16cid w16 w16cex w16sdtdh w16sdtfl w16du wp14">
   <w:p>
     <w:pPr>
       <w:pStyle w:val="Header"/>

</xml_diff>